<commit_message>
Fixes PDF y Word
</commit_message>
<xml_diff>
--- a/webapp/templates/word/Beneficios_Extralegales.docx
+++ b/webapp/templates/word/Beneficios_Extralegales.docx
@@ -1,85 +1,115 @@
 
 <file path=word/document.xml><?xml version="1.0" encoding="utf-8"?>
-<w:document xmlns:wpc="http://schemas.microsoft.com/office/word/2010/wordprocessingCanvas" xmlns:cx="http://schemas.microsoft.com/office/drawing/2014/chartex" xmlns:cx1="http://schemas.microsoft.com/office/drawing/2015/9/8/chartex" xmlns:cx2="http://schemas.microsoft.com/office/drawing/2015/10/21/chartex" xmlns:cx3="http://schemas.microsoft.com/office/drawing/2016/5/9/chartex" xmlns:cx4="http://schemas.microsoft.com/office/drawing/2016/5/10/chartex" xmlns:cx5="http://schemas.microsoft.com/office/drawing/2016/5/11/chartex" xmlns:cx6="http://schemas.microsoft.com/office/drawing/2016/5/12/chartex" xmlns:cx7="http://schemas.microsoft.com/office/drawing/2016/5/13/chartex" xmlns:cx8="http://schemas.microsoft.com/office/drawing/2016/5/14/chartex" xmlns:mc="http://schemas.openxmlformats.org/markup-compatibility/2006" xmlns:aink="http://schemas.microsoft.com/office/drawing/2016/ink" xmlns:am3d="http://schemas.microsoft.com/office/drawing/2017/model3d" xmlns:o="urn:schemas-microsoft-com:office:office" xmlns:oel="http://schemas.microsoft.com/office/2019/extlst" xmlns:r="http://schemas.openxmlformats.org/officeDocument/2006/relationships" xmlns:m="http://schemas.openxmlformats.org/officeDocument/2006/math" xmlns:v="urn:schemas-microsoft-com:vml" xmlns:wp14="http://schemas.microsoft.com/office/word/2010/wordprocessingDrawing" xmlns:wp="http://schemas.openxmlformats.org/drawingml/2006/wordprocessingDrawing" xmlns:w10="urn:schemas-microsoft-com:office:word" xmlns:w="http://schemas.openxmlformats.org/wordprocessingml/2006/main" xmlns:w14="http://schemas.microsoft.com/office/word/2010/wordml" xmlns:w15="http://schemas.microsoft.com/office/word/2012/wordml" xmlns:w16cex="http://schemas.microsoft.com/office/word/2018/wordml/cex" xmlns:w16cid="http://schemas.microsoft.com/office/word/2016/wordml/cid" xmlns:w16="http://schemas.microsoft.com/office/word/2018/wordml" xmlns:w16sdtdh="http://schemas.microsoft.com/office/word/2020/wordml/sdtdatahash" xmlns:w16se="http://schemas.microsoft.com/office/word/2015/wordml/symex" xmlns:wpg="http://schemas.microsoft.com/office/word/2010/wordprocessingGroup" xmlns:wpi="http://schemas.microsoft.com/office/word/2010/wordprocessingInk" xmlns:wne="http://schemas.microsoft.com/office/word/2006/wordml" xmlns:wps="http://schemas.microsoft.com/office/word/2010/wordprocessingShape" mc:Ignorable="w14 w15 w16se w16cid w16 w16cex w16sdtdh wp14">
+<w:document xmlns:wpc="http://schemas.microsoft.com/office/word/2010/wordprocessingCanvas" xmlns:cx="http://schemas.microsoft.com/office/drawing/2014/chartex" xmlns:cx1="http://schemas.microsoft.com/office/drawing/2015/9/8/chartex" xmlns:cx2="http://schemas.microsoft.com/office/drawing/2015/10/21/chartex" xmlns:cx3="http://schemas.microsoft.com/office/drawing/2016/5/9/chartex" xmlns:cx4="http://schemas.microsoft.com/office/drawing/2016/5/10/chartex" xmlns:cx5="http://schemas.microsoft.com/office/drawing/2016/5/11/chartex" xmlns:cx6="http://schemas.microsoft.com/office/drawing/2016/5/12/chartex" xmlns:cx7="http://schemas.microsoft.com/office/drawing/2016/5/13/chartex" xmlns:cx8="http://schemas.microsoft.com/office/drawing/2016/5/14/chartex" xmlns:mc="http://schemas.openxmlformats.org/markup-compatibility/2006" xmlns:aink="http://schemas.microsoft.com/office/drawing/2016/ink" xmlns:am3d="http://schemas.microsoft.com/office/drawing/2017/model3d" xmlns:o="urn:schemas-microsoft-com:office:office" xmlns:r="http://schemas.openxmlformats.org/officeDocument/2006/relationships" xmlns:m="http://schemas.openxmlformats.org/officeDocument/2006/math" xmlns:v="urn:schemas-microsoft-com:vml" xmlns:wp14="http://schemas.microsoft.com/office/word/2010/wordprocessingDrawing" xmlns:wp="http://schemas.openxmlformats.org/drawingml/2006/wordprocessingDrawing" xmlns:w10="urn:schemas-microsoft-com:office:word" xmlns:w="http://schemas.openxmlformats.org/wordprocessingml/2006/main" xmlns:w14="http://schemas.microsoft.com/office/word/2010/wordml" xmlns:w15="http://schemas.microsoft.com/office/word/2012/wordml" xmlns:w16cex="http://schemas.microsoft.com/office/word/2018/wordml/cex" xmlns:w16cid="http://schemas.microsoft.com/office/word/2016/wordml/cid" xmlns:w16="http://schemas.microsoft.com/office/word/2018/wordml" xmlns:w16sdtdh="http://schemas.microsoft.com/office/word/2020/wordml/sdtdatahash" xmlns:w16se="http://schemas.microsoft.com/office/word/2015/wordml/symex" xmlns:wpg="http://schemas.microsoft.com/office/word/2010/wordprocessingGroup" xmlns:wpi="http://schemas.microsoft.com/office/word/2010/wordprocessingInk" xmlns:wne="http://schemas.microsoft.com/office/word/2006/wordml" xmlns:wps="http://schemas.microsoft.com/office/word/2010/wordprocessingShape" mc:Ignorable="w14 w15 w16se w16cid w16 w16cex w16sdtdh wp14">
   <w:body>
     <w:p>
       <w:pPr>
         <w:pStyle w:val="Ttulo"/>
-      </w:pPr>
-      <w:r>
-        <w:rPr>
+        <w:rPr>
+          <w:b/>
+          <w:bCs/>
+        </w:rPr>
+      </w:pPr>
+      <w:r>
+        <w:rPr>
+          <w:b/>
+          <w:bCs/>
           <w:spacing w:val="-2"/>
         </w:rPr>
         <w:t>CONOCIMIENTO</w:t>
       </w:r>
       <w:r>
         <w:rPr>
+          <w:b/>
+          <w:bCs/>
           <w:spacing w:val="-8"/>
         </w:rPr>
         <w:t xml:space="preserve"> </w:t>
       </w:r>
       <w:r>
         <w:rPr>
+          <w:b/>
+          <w:bCs/>
           <w:spacing w:val="-2"/>
         </w:rPr>
         <w:t>Y</w:t>
       </w:r>
       <w:r>
         <w:rPr>
+          <w:b/>
+          <w:bCs/>
           <w:spacing w:val="-7"/>
         </w:rPr>
         <w:t xml:space="preserve"> </w:t>
       </w:r>
       <w:r>
         <w:rPr>
+          <w:b/>
+          <w:bCs/>
           <w:spacing w:val="-2"/>
         </w:rPr>
         <w:t>DECLARACIÓN</w:t>
       </w:r>
       <w:r>
         <w:rPr>
+          <w:b/>
+          <w:bCs/>
           <w:spacing w:val="-5"/>
         </w:rPr>
         <w:t xml:space="preserve"> </w:t>
       </w:r>
       <w:r>
         <w:rPr>
+          <w:b/>
+          <w:bCs/>
           <w:spacing w:val="-2"/>
         </w:rPr>
         <w:t>PLAN</w:t>
       </w:r>
       <w:r>
         <w:rPr>
+          <w:b/>
+          <w:bCs/>
           <w:spacing w:val="-7"/>
         </w:rPr>
         <w:t xml:space="preserve"> </w:t>
       </w:r>
       <w:r>
         <w:rPr>
+          <w:b/>
+          <w:bCs/>
           <w:spacing w:val="-2"/>
         </w:rPr>
         <w:t>DE</w:t>
       </w:r>
       <w:r>
         <w:rPr>
+          <w:b/>
+          <w:bCs/>
           <w:spacing w:val="-8"/>
         </w:rPr>
         <w:t xml:space="preserve"> </w:t>
       </w:r>
       <w:r>
         <w:rPr>
+          <w:b/>
+          <w:bCs/>
           <w:spacing w:val="-2"/>
         </w:rPr>
         <w:t>BENEFICIOS</w:t>
       </w:r>
       <w:r>
         <w:rPr>
+          <w:b/>
+          <w:bCs/>
           <w:spacing w:val="-5"/>
         </w:rPr>
         <w:t xml:space="preserve"> </w:t>
       </w:r>
       <w:r>
         <w:rPr>
+          <w:b/>
+          <w:bCs/>
           <w:spacing w:val="-2"/>
         </w:rPr>
         <w:t>EXTRALEGALES</w:t>
@@ -121,7 +151,14 @@
         <w:t xml:space="preserve"> </w:t>
       </w:r>
       <w:r>
-        <w:t>[[Nombre]],</w:t>
+        <w:rPr>
+          <w:b/>
+          <w:bCs/>
+        </w:rPr>
+        <w:t>[[Nombre]]</w:t>
+      </w:r>
+      <w:r>
+        <w:t>,</w:t>
       </w:r>
       <w:r>
         <w:rPr>
@@ -149,6 +186,8 @@
       </w:r>
       <w:r>
         <w:rPr>
+          <w:b/>
+          <w:bCs/>
           <w:spacing w:val="30"/>
         </w:rPr>
         <w:t>[[Cedula]]</w:t>
@@ -235,7 +274,17 @@
         <w:jc w:val="both"/>
       </w:pPr>
       <w:r>
-        <w:t>Que es de mi conocimiento que DIACO S.A., ha implementado un Plan de Beneficios Extralegales, que busca garantizar al bienestar y mejoramiento del nivel de vida de sus trabajadores.</w:t>
+        <w:t xml:space="preserve">Que es de mi conocimiento que </w:t>
+      </w:r>
+      <w:r>
+        <w:rPr>
+          <w:b/>
+          <w:bCs/>
+        </w:rPr>
+        <w:t>DIACO S.A</w:t>
+      </w:r>
+      <w:r>
+        <w:t>., ha implementado un Plan de Beneficios Extralegales, que busca garantizar al bienestar y mejoramiento del nivel de vida de sus trabajadores.</w:t>
       </w:r>
     </w:p>
     <w:p>
@@ -860,7 +909,17 @@
         <w:t xml:space="preserve"> </w:t>
       </w:r>
       <w:r>
-        <w:t>entiendo que DIACO S.A., se reserva el derecho de modificar, ajustar y/o suprimir los auxilios aquí incluidos cuando resulte necesario para la empresa sin que ello se entienda como una desmejora en las condiciones laborales.</w:t>
+        <w:t xml:space="preserve">entiendo que </w:t>
+      </w:r>
+      <w:r>
+        <w:rPr>
+          <w:b/>
+          <w:bCs/>
+        </w:rPr>
+        <w:t>DIACO S.A</w:t>
+      </w:r>
+      <w:r>
+        <w:t>., se reserva el derecho de modificar, ajustar y/o suprimir los auxilios aquí incluidos cuando resulte necesario para la empresa sin que ello se entienda como una desmejora en las condiciones laborales.</w:t>
       </w:r>
     </w:p>
     <w:p>
@@ -1361,10 +1420,16 @@
         <w:spacing w:before="25"/>
         <w:ind w:firstLine="197"/>
         <w:rPr>
+          <w:b/>
+          <w:bCs/>
           <w:sz w:val="20"/>
         </w:rPr>
       </w:pPr>
       <w:r>
+        <w:rPr>
+          <w:b/>
+          <w:bCs/>
+        </w:rPr>
         <w:t>[[Nombre]],</w:t>
       </w:r>
     </w:p>
@@ -1373,21 +1438,31 @@
         <w:pStyle w:val="Textoindependiente"/>
         <w:spacing w:before="20"/>
         <w:ind w:left="197"/>
-      </w:pPr>
-      <w:r>
-        <w:rPr>
+        <w:rPr>
+          <w:b/>
+          <w:bCs/>
+        </w:rPr>
+      </w:pPr>
+      <w:r>
+        <w:rPr>
+          <w:b/>
+          <w:bCs/>
           <w:spacing w:val="-2"/>
         </w:rPr>
         <w:t>NOMBRE</w:t>
       </w:r>
       <w:r>
         <w:rPr>
+          <w:b/>
+          <w:bCs/>
           <w:spacing w:val="-10"/>
         </w:rPr>
         <w:t xml:space="preserve"> </w:t>
       </w:r>
       <w:r>
         <w:rPr>
+          <w:b/>
+          <w:bCs/>
           <w:spacing w:val="-2"/>
         </w:rPr>
         <w:t>TRABAJADOR</w:t>
@@ -1411,6 +1486,8 @@
       </w:r>
       <w:r>
         <w:rPr>
+          <w:b/>
+          <w:bCs/>
           <w:spacing w:val="30"/>
         </w:rPr>
         <w:t>[[Cedula]]</w:t>
@@ -1429,6 +1506,8 @@
       </w:r>
       <w:r>
         <w:rPr>
+          <w:b/>
+          <w:bCs/>
           <w:spacing w:val="30"/>
         </w:rPr>
         <w:t>[[</w:t>
@@ -1436,21 +1515,18 @@
       <w:proofErr w:type="spellStart"/>
       <w:r>
         <w:rPr>
+          <w:b/>
+          <w:bCs/>
           <w:spacing w:val="30"/>
           <w:lang w:val="es-AR"/>
         </w:rPr>
-        <w:t>CiudadExpedicio</w:t>
-      </w:r>
-      <w:r>
-        <w:rPr>
-          <w:spacing w:val="30"/>
-          <w:lang w:val="es-AR"/>
-        </w:rPr>
-        <w:t>n</w:t>
+        <w:t>CiudadExpedicion</w:t>
       </w:r>
       <w:proofErr w:type="spellEnd"/>
       <w:r>
         <w:rPr>
+          <w:b/>
+          <w:bCs/>
           <w:spacing w:val="30"/>
         </w:rPr>
         <w:t>]]</w:t>
@@ -1544,12 +1620,16 @@
       </w:r>
       <w:r>
         <w:rPr>
+          <w:b/>
+          <w:bCs/>
           <w:sz w:val="20"/>
         </w:rPr>
         <w:t>1</w:t>
       </w:r>
       <w:r>
         <w:rPr>
+          <w:b/>
+          <w:bCs/>
           <w:spacing w:val="-4"/>
           <w:sz w:val="20"/>
         </w:rPr>
@@ -1557,12 +1637,16 @@
       </w:r>
       <w:r>
         <w:rPr>
+          <w:b/>
+          <w:bCs/>
           <w:sz w:val="20"/>
         </w:rPr>
         <w:t>de</w:t>
       </w:r>
       <w:r>
         <w:rPr>
+          <w:b/>
+          <w:bCs/>
           <w:spacing w:val="-6"/>
           <w:sz w:val="20"/>
         </w:rPr>
@@ -1570,6 +1654,8 @@
       </w:r>
       <w:r>
         <w:rPr>
+          <w:b/>
+          <w:bCs/>
           <w:spacing w:val="-10"/>
           <w:sz w:val="20"/>
         </w:rPr>
@@ -1593,7 +1679,7 @@
 </file>
 
 <file path=word/numbering.xml><?xml version="1.0" encoding="utf-8"?>
-<w:numbering xmlns:wpc="http://schemas.microsoft.com/office/word/2010/wordprocessingCanvas" xmlns:cx="http://schemas.microsoft.com/office/drawing/2014/chartex" xmlns:cx1="http://schemas.microsoft.com/office/drawing/2015/9/8/chartex" xmlns:cx2="http://schemas.microsoft.com/office/drawing/2015/10/21/chartex" xmlns:cx3="http://schemas.microsoft.com/office/drawing/2016/5/9/chartex" xmlns:cx4="http://schemas.microsoft.com/office/drawing/2016/5/10/chartex" xmlns:cx5="http://schemas.microsoft.com/office/drawing/2016/5/11/chartex" xmlns:cx6="http://schemas.microsoft.com/office/drawing/2016/5/12/chartex" xmlns:cx7="http://schemas.microsoft.com/office/drawing/2016/5/13/chartex" xmlns:cx8="http://schemas.microsoft.com/office/drawing/2016/5/14/chartex" xmlns:mc="http://schemas.openxmlformats.org/markup-compatibility/2006" xmlns:aink="http://schemas.microsoft.com/office/drawing/2016/ink" xmlns:am3d="http://schemas.microsoft.com/office/drawing/2017/model3d" xmlns:o="urn:schemas-microsoft-com:office:office" xmlns:oel="http://schemas.microsoft.com/office/2019/extlst" xmlns:r="http://schemas.openxmlformats.org/officeDocument/2006/relationships" xmlns:m="http://schemas.openxmlformats.org/officeDocument/2006/math" xmlns:v="urn:schemas-microsoft-com:vml" xmlns:wp14="http://schemas.microsoft.com/office/word/2010/wordprocessingDrawing" xmlns:wp="http://schemas.openxmlformats.org/drawingml/2006/wordprocessingDrawing" xmlns:w10="urn:schemas-microsoft-com:office:word" xmlns:w="http://schemas.openxmlformats.org/wordprocessingml/2006/main" xmlns:w14="http://schemas.microsoft.com/office/word/2010/wordml" xmlns:w15="http://schemas.microsoft.com/office/word/2012/wordml" xmlns:w16cex="http://schemas.microsoft.com/office/word/2018/wordml/cex" xmlns:w16cid="http://schemas.microsoft.com/office/word/2016/wordml/cid" xmlns:w16="http://schemas.microsoft.com/office/word/2018/wordml" xmlns:w16sdtdh="http://schemas.microsoft.com/office/word/2020/wordml/sdtdatahash" xmlns:w16se="http://schemas.microsoft.com/office/word/2015/wordml/symex" xmlns:wpg="http://schemas.microsoft.com/office/word/2010/wordprocessingGroup" xmlns:wpi="http://schemas.microsoft.com/office/word/2010/wordprocessingInk" xmlns:wne="http://schemas.microsoft.com/office/word/2006/wordml" xmlns:wps="http://schemas.microsoft.com/office/word/2010/wordprocessingShape" mc:Ignorable="w14 w15 w16se w16cid w16 w16cex w16sdtdh wp14">
+<w:numbering xmlns:wpc="http://schemas.microsoft.com/office/word/2010/wordprocessingCanvas" xmlns:cx="http://schemas.microsoft.com/office/drawing/2014/chartex" xmlns:cx1="http://schemas.microsoft.com/office/drawing/2015/9/8/chartex" xmlns:cx2="http://schemas.microsoft.com/office/drawing/2015/10/21/chartex" xmlns:cx3="http://schemas.microsoft.com/office/drawing/2016/5/9/chartex" xmlns:cx4="http://schemas.microsoft.com/office/drawing/2016/5/10/chartex" xmlns:cx5="http://schemas.microsoft.com/office/drawing/2016/5/11/chartex" xmlns:cx6="http://schemas.microsoft.com/office/drawing/2016/5/12/chartex" xmlns:cx7="http://schemas.microsoft.com/office/drawing/2016/5/13/chartex" xmlns:cx8="http://schemas.microsoft.com/office/drawing/2016/5/14/chartex" xmlns:mc="http://schemas.openxmlformats.org/markup-compatibility/2006" xmlns:aink="http://schemas.microsoft.com/office/drawing/2016/ink" xmlns:am3d="http://schemas.microsoft.com/office/drawing/2017/model3d" xmlns:o="urn:schemas-microsoft-com:office:office" xmlns:r="http://schemas.openxmlformats.org/officeDocument/2006/relationships" xmlns:m="http://schemas.openxmlformats.org/officeDocument/2006/math" xmlns:v="urn:schemas-microsoft-com:vml" xmlns:wp14="http://schemas.microsoft.com/office/word/2010/wordprocessingDrawing" xmlns:wp="http://schemas.openxmlformats.org/drawingml/2006/wordprocessingDrawing" xmlns:w10="urn:schemas-microsoft-com:office:word" xmlns:w="http://schemas.openxmlformats.org/wordprocessingml/2006/main" xmlns:w14="http://schemas.microsoft.com/office/word/2010/wordml" xmlns:w15="http://schemas.microsoft.com/office/word/2012/wordml" xmlns:w16cex="http://schemas.microsoft.com/office/word/2018/wordml/cex" xmlns:w16cid="http://schemas.microsoft.com/office/word/2016/wordml/cid" xmlns:w16="http://schemas.microsoft.com/office/word/2018/wordml" xmlns:w16sdtdh="http://schemas.microsoft.com/office/word/2020/wordml/sdtdatahash" xmlns:w16se="http://schemas.microsoft.com/office/word/2015/wordml/symex" xmlns:wpg="http://schemas.microsoft.com/office/word/2010/wordprocessingGroup" xmlns:wpi="http://schemas.microsoft.com/office/word/2010/wordprocessingInk" xmlns:wne="http://schemas.microsoft.com/office/word/2006/wordml" xmlns:wps="http://schemas.microsoft.com/office/word/2010/wordprocessingShape" mc:Ignorable="w14 w15 w16se w16cid w16 w16cex w16sdtdh wp14">
   <w:abstractNum w:abstractNumId="0" w15:restartNumberingAfterBreak="0">
     <w:nsid w:val="254E6346"/>
     <w:multiLevelType w:val="hybridMultilevel"/>
@@ -1717,7 +1803,7 @@
       </w:rPr>
     </w:lvl>
   </w:abstractNum>
-  <w:num w:numId="1" w16cid:durableId="51656264">
+  <w:num w:numId="1">
     <w:abstractNumId w:val="0"/>
   </w:num>
 </w:numbering>
@@ -2131,6 +2217,7 @@
   <w:style w:type="character" w:default="1" w:styleId="Fuentedeprrafopredeter">
     <w:name w:val="Default Paragraph Font"/>
     <w:uiPriority w:val="1"/>
+    <w:semiHidden/>
     <w:unhideWhenUsed/>
   </w:style>
   <w:style w:type="table" w:default="1" w:styleId="Tablanormal">

</xml_diff>